<commit_message>
CERTAIN-COAST: Innovation section; full liquefaction citation in Impact
Innovation: the core innovation and the three gaps it closes, eleven
technical innovations (M1-M5, P1-P5, V1) at a glance with a novelty
check and test for each, a warning-chain figure, one card per
innovation, the preparatory synthetic result, TRL now and at M36 on
the EU definitions, three delivery innovations, protection and
sharing, and a 'What is new' section. Names and references are read
from the State of the Art data.

Impact: source [3] now gives the full Mavroulis et al. (2021) citation.

Co-Authored-By: Claude Opus 5.5 <noreply@anthropic.com>
Claude-Session: https://claude.ai/code/session_016Cdcj2FTAQGBVsJUyYJR2M
</commit_message>
<xml_diff>
--- a/docs/certain_coast/CERTAIN-COAST_Impact.docx
+++ b/docs/certain_coast/CERTAIN-COAST_Impact.docx
@@ -4653,7 +4653,7 @@
           <w:i w:val="0"/>
           <w:sz w:val="19"/>
         </w:rPr>
-        <w:t xml:space="preserve">[3] Geosciences (MDPI), 11(5), article 215 (2021): field reconnaissance and liquefaction susceptibility mapping after the 26 November 2019 Durrës earthquake. </w:t>
+        <w:t xml:space="preserve">[3] Mavroulis, S., Lekkas, E. and Carydis, P. (2021). Liquefaction phenomena induced by the 26 November 2019, Mw = 6.4 Durrës (Albania) earthquake and liquefaction susceptibility assessment in the affected area. Geosciences 11(5), 215. </w:t>
       </w:r>
       <w:hyperlink r:id="rId13">
         <w:r>
@@ -4663,7 +4663,7 @@
             <w:u w:val="single"/>
             <w:sz w:val="17"/>
           </w:rPr>
-          <w:t xml:space="preserve">https://www.mdpi.com/2076-3263/11/5/215</w:t>
+          <w:t xml:space="preserve">https://doi.org/10.3390/geosciences11050215</w:t>
         </w:r>
       </w:hyperlink>
     </w:p>

</xml_diff>